<commit_message>
docs(lab02): align report with course format
</commit_message>
<xml_diff>
--- a/labs/lab02/report/_resources/docx/reference.docx
+++ b/labs/lab02/report/_resources/docx/reference.docx
@@ -318,7 +318,7 @@
         <w:numRestart w:val="eachSect"/>
       </w:footnotePr>
       <w:pgSz w:w="11906" w:h="16838"/>
-      <w:pgMar w:top="1134" w:bottom="1134" w:left="1701" w:right="850"/>
+      <w:pgMar w:top="1134" w:bottom="1134" w:left="1417" w:right="850"/>
     </w:sectPr>
   </w:body>
 </w:document>
@@ -504,12 +504,16 @@
     <w:name w:val="Normal"/>
     <w:qFormat/>
     <w:pPr>
-      <w:spacing w:line="360" w:lineRule="auto" w:after="0"/>
+      <w:spacing w:line="276" w:lineRule="auto" w:after="80"/>
       <w:ind w:firstLine="709"/>
+      <w:jc w:val="both"/>
     </w:pPr>
     <w:rPr>
       <w:rFonts w:ascii="Times New Roman" w:hAnsi="Times New Roman" w:eastAsia="Times New Roman"/>
-      <w:sz w:val="28"/>
+      <w:b w:val="0"/>
+      <w:i w:val="0"/>
+      <w:color w:val="000000"/>
+      <w:sz w:val="24"/>
     </w:rPr>
   </w:style>
   <w:style w:type="paragraph" w:styleId="BodyText">
@@ -518,11 +522,14 @@
     <w:link w:val="BodyTextChar"/>
     <w:qFormat/>
     <w:pPr>
-      <w:spacing w:before="180" w:after="0" w:line="360" w:lineRule="auto"/>
+      <w:spacing w:before="180" w:after="60" w:line="276" w:lineRule="auto"/>
     </w:pPr>
     <w:rPr>
       <w:rFonts w:ascii="Times New Roman" w:hAnsi="Times New Roman" w:eastAsia="Times New Roman"/>
-      <w:sz w:val="28"/>
+      <w:b w:val="0"/>
+      <w:i w:val="0"/>
+      <w:color w:val="000000"/>
+      <w:sz w:val="24"/>
     </w:rPr>
   </w:style>
   <w:style w:type="paragraph" w:customStyle="1" w:styleId="FirstParagraph">
@@ -560,13 +567,17 @@
     <w:qFormat/>
     <w:rsid w:val="00A10FD9"/>
     <w:pPr>
-      <w:spacing w:after="80" w:line="240" w:lineRule="auto"/>
+      <w:keepNext/>
+      <w:spacing w:after="160" w:line="240" w:lineRule="auto" w:before="2400"/>
       <w:ind w:firstLine="0"/>
       <w:contextualSpacing/>
       <w:jc w:val="center"/>
     </w:pPr>
     <w:rPr>
       <w:rFonts w:asciiTheme="majorHAnsi" w:eastAsiaTheme="majorEastAsia" w:hAnsiTheme="majorHAnsi" w:cstheme="majorBidi" w:ascii="Times New Roman" w:hAnsi="Times New Roman" w:eastAsia="Times New Roman"/>
+      <w:b/>
+      <w:i w:val="0"/>
+      <w:color w:val="000000"/>
       <w:sz w:val="32"/>
       <w:szCs w:val="56"/>
     </w:rPr>
@@ -592,15 +603,21 @@
     <w:qFormat/>
     <w:rsid w:val="00A10FD9"/>
     <w:pPr>
+      <w:keepNext/>
       <w:numPr>
         <w:ilvl w:val="1"/>
       </w:numPr>
+      <w:spacing w:after="360" w:before="0" w:line="240" w:lineRule="auto"/>
       <w:ind w:firstLine="0"/>
+      <w:jc w:val="center"/>
     </w:pPr>
     <w:rPr>
       <w:rFonts w:eastAsiaTheme="majorEastAsia" w:cstheme="majorBidi" w:ascii="Times New Roman" w:hAnsi="Times New Roman" w:eastAsia="Times New Roman"/>
+      <w:b/>
+      <w:i w:val="0"/>
+      <w:color w:val="000000"/>
       <w:spacing w:val="15"/>
-      <w:sz w:val="28"/>
+      <w:sz w:val="24"/>
       <w:szCs w:val="28"/>
     </w:rPr>
   </w:style>
@@ -626,11 +643,16 @@
     <w:pPr>
       <w:keepNext/>
       <w:keepLines/>
+      <w:spacing w:after="0" w:before="0" w:line="240" w:lineRule="auto"/>
       <w:ind w:firstLine="0"/>
+      <w:jc w:val="center"/>
     </w:pPr>
     <w:rPr>
       <w:rFonts w:ascii="Times New Roman" w:hAnsi="Times New Roman" w:eastAsia="Times New Roman"/>
-      <w:sz w:val="28"/>
+      <w:b w:val="0"/>
+      <w:i w:val="0"/>
+      <w:color w:val="000000"/>
+      <w:sz w:val="24"/>
       <w:szCs w:val="24"/>
     </w:rPr>
   </w:style>
@@ -642,11 +664,16 @@
     <w:pPr>
       <w:keepNext/>
       <w:keepLines/>
+      <w:spacing w:after="0" w:before="0" w:line="240" w:lineRule="auto"/>
       <w:ind w:firstLine="0"/>
+      <w:jc w:val="center"/>
     </w:pPr>
     <w:rPr>
       <w:rFonts w:ascii="Times New Roman" w:hAnsi="Times New Roman" w:eastAsia="Times New Roman"/>
-      <w:sz w:val="28"/>
+      <w:b w:val="0"/>
+      <w:i w:val="0"/>
+      <w:color w:val="000000"/>
+      <w:sz w:val="24"/>
       <w:szCs w:val="24"/>
     </w:rPr>
   </w:style>
@@ -707,15 +734,16 @@
     <w:pPr>
       <w:keepNext/>
       <w:keepLines/>
-      <w:spacing w:before="200" w:after="80"/>
+      <w:spacing w:before="240" w:after="120"/>
       <w:ind w:firstLine="0"/>
       <w:outlineLvl w:val="0"/>
     </w:pPr>
     <w:rPr>
       <w:rFonts w:asciiTheme="majorHAnsi" w:eastAsiaTheme="majorEastAsia" w:hAnsiTheme="majorHAnsi" w:cstheme="majorBidi" w:ascii="Times New Roman" w:hAnsi="Times New Roman" w:eastAsia="Times New Roman"/>
       <w:b/>
-      <w:color w:val="2E5E91"/>
-      <w:sz w:val="32"/>
+      <w:i w:val="0"/>
+      <w:color w:val="000000"/>
+      <w:sz w:val="28"/>
       <w:szCs w:val="40"/>
     </w:rPr>
   </w:style>
@@ -732,15 +760,16 @@
     <w:pPr>
       <w:keepNext/>
       <w:keepLines/>
-      <w:spacing w:before="200" w:after="80"/>
+      <w:spacing w:before="240" w:after="120"/>
       <w:ind w:firstLine="0"/>
       <w:outlineLvl w:val="1"/>
     </w:pPr>
     <w:rPr>
       <w:rFonts w:asciiTheme="majorHAnsi" w:eastAsiaTheme="majorEastAsia" w:hAnsiTheme="majorHAnsi" w:cstheme="majorBidi" w:ascii="Times New Roman" w:hAnsi="Times New Roman" w:eastAsia="Times New Roman"/>
       <w:b/>
-      <w:color w:val="2E5E91"/>
-      <w:sz w:val="30"/>
+      <w:i w:val="0"/>
+      <w:color w:val="000000"/>
+      <w:sz w:val="24"/>
       <w:szCs w:val="32"/>
     </w:rPr>
   </w:style>
@@ -757,15 +786,16 @@
     <w:pPr>
       <w:keepNext/>
       <w:keepLines/>
-      <w:spacing w:before="200" w:after="80"/>
+      <w:spacing w:before="240" w:after="120"/>
       <w:ind w:firstLine="0"/>
       <w:outlineLvl w:val="2"/>
     </w:pPr>
     <w:rPr>
       <w:rFonts w:eastAsiaTheme="majorEastAsia" w:cstheme="majorBidi" w:ascii="Times New Roman" w:hAnsi="Times New Roman" w:eastAsia="Times New Roman"/>
       <w:b/>
-      <w:color w:val="2E5E91"/>
-      <w:sz w:val="28"/>
+      <w:i/>
+      <w:color w:val="000000"/>
+      <w:sz w:val="24"/>
       <w:szCs w:val="28"/>
     </w:rPr>
   </w:style>
@@ -782,14 +812,16 @@
     <w:pPr>
       <w:keepNext/>
       <w:keepLines/>
-      <w:spacing w:before="80" w:after="40"/>
+      <w:spacing w:before="240" w:after="120"/>
       <w:outlineLvl w:val="3"/>
     </w:pPr>
     <w:rPr>
-      <w:rFonts w:eastAsiaTheme="majorEastAsia" w:cstheme="majorBidi"/>
+      <w:rFonts w:eastAsiaTheme="majorEastAsia" w:cstheme="majorBidi" w:ascii="Times New Roman" w:hAnsi="Times New Roman" w:eastAsia="Times New Roman"/>
+      <w:b/>
       <w:i/>
       <w:iCs/>
-      <w:color w:val="0F4761" w:themeColor="accent1" w:themeShade="BF"/>
+      <w:color w:val="000000"/>
+      <w:sz w:val="24"/>
     </w:rPr>
   </w:style>
   <w:style w:type="paragraph" w:styleId="Heading5">
@@ -1192,14 +1224,17 @@
     <w:unhideWhenUsed/>
     <w:qFormat/>
     <w:pPr>
-      <w:spacing w:before="240" w:line="259" w:lineRule="auto"/>
+      <w:spacing w:before="160" w:line="259" w:lineRule="auto" w:after="240"/>
+      <w:jc w:val="center"/>
       <w:outlineLvl w:val="9"/>
     </w:pPr>
     <w:rPr>
-      <w:rFonts w:asciiTheme="majorHAnsi" w:eastAsiaTheme="majorEastAsia" w:hAnsiTheme="majorHAnsi" w:cstheme="majorBidi"/>
-      <w:b w:val="0"/>
+      <w:rFonts w:asciiTheme="majorHAnsi" w:eastAsiaTheme="majorEastAsia" w:hAnsiTheme="majorHAnsi" w:cstheme="majorBidi" w:ascii="Times New Roman" w:hAnsi="Times New Roman" w:eastAsia="Times New Roman"/>
+      <w:b/>
       <w:bCs w:val="0"/>
-      <w:color w:val="365F91" w:themeColor="accent1" w:themeShade="BF"/>
+      <w:i w:val="0"/>
+      <w:color w:val="000000"/>
+      <w:sz w:val="28"/>
     </w:rPr>
   </w:style>
 </w:styles>

</xml_diff>